<commit_message>
docs(ai-skill-studio): repair pixel clipping in customer-facing package
</commit_message>
<xml_diff>
--- a/docs/commercial/business-32-ai-skill-studio/customer-package/Business32_Skill_Discovery_Worksheet.docx
+++ b/docs/commercial/business-32-ai-skill-studio/customer-package/Business32_Skill_Discovery_Worksheet.docx
@@ -29,7 +29,7 @@
     </w:p>
     <w:p>
       <w:pPr>
-        <w:spacing w:after="160"/>
+        <w:spacing w:after="80"/>
       </w:pPr>
       <w:r>
         <w:rPr>
@@ -38,6 +38,19 @@
           <w:sz w:val="16"/>
         </w:rPr>
         <w:t>제안검토용 DRAFT · 합성 샘플 기반 · 실제 파일·개인정보는 넣지 마세요</w:t>
+      </w:r>
+    </w:p>
+    <w:p>
+      <w:pPr>
+        <w:spacing w:after="160"/>
+        <w:jc w:val="right"/>
+      </w:pPr>
+      <w:r>
+        <w:rPr>
+          <w:color w:val="6B7280"/>
+          <w:sz w:val="16"/>
+        </w:rPr>
+        <w:t>페이지 1/2</w:t>
       </w:r>
     </w:p>
     <w:p>
@@ -70,7 +83,7 @@
           <w:b/>
           <w:sz w:val="20"/>
         </w:rPr>
-        <w:t>☐ Q1. 반복되는 업무는 무엇인가</w:t>
+        <w:t>Q1. 반복되는 업무는 무엇인가</w:t>
       </w:r>
     </w:p>
     <w:p>
@@ -111,6 +124,14 @@
     </w:p>
     <w:p>
       <w:pPr>
+        <w:spacing w:after="40"/>
+        <w:pBdr>
+          <w:bottom w:val="single" w:sz="6" w:space="1" w:color="B7B7B7"/>
+        </w:pBdr>
+      </w:pPr>
+    </w:p>
+    <w:p>
+      <w:pPr>
         <w:spacing w:after="0"/>
       </w:pPr>
       <w:r>
@@ -118,7 +139,7 @@
           <w:b/>
           <w:sz w:val="20"/>
         </w:rPr>
-        <w:t>☐ Q2. 누가 실행하는가</w:t>
+        <w:t>Q2. 누가 실행하는가</w:t>
       </w:r>
     </w:p>
     <w:p>
@@ -159,6 +180,14 @@
     </w:p>
     <w:p>
       <w:pPr>
+        <w:spacing w:after="40"/>
+        <w:pBdr>
+          <w:bottom w:val="single" w:sz="6" w:space="1" w:color="B7B7B7"/>
+        </w:pBdr>
+      </w:pPr>
+    </w:p>
+    <w:p>
+      <w:pPr>
         <w:spacing w:after="0"/>
       </w:pPr>
       <w:r>
@@ -166,7 +195,7 @@
           <w:b/>
           <w:sz w:val="20"/>
         </w:rPr>
-        <w:t>☐ Q3. 누가 검토·승인하는가</w:t>
+        <w:t>Q3. 누가 검토·승인하는가</w:t>
       </w:r>
     </w:p>
     <w:p>
@@ -207,6 +236,14 @@
     </w:p>
     <w:p>
       <w:pPr>
+        <w:spacing w:after="40"/>
+        <w:pBdr>
+          <w:bottom w:val="single" w:sz="6" w:space="1" w:color="B7B7B7"/>
+        </w:pBdr>
+      </w:pPr>
+    </w:p>
+    <w:p>
+      <w:pPr>
         <w:spacing w:after="0"/>
       </w:pPr>
       <w:r>
@@ -214,7 +251,7 @@
           <w:b/>
           <w:sz w:val="20"/>
         </w:rPr>
-        <w:t>☐ Q4. 입력자료는 무엇인가</w:t>
+        <w:t>Q4. 입력자료는 무엇인가</w:t>
       </w:r>
     </w:p>
     <w:p>
@@ -255,6 +292,14 @@
     </w:p>
     <w:p>
       <w:pPr>
+        <w:spacing w:after="40"/>
+        <w:pBdr>
+          <w:bottom w:val="single" w:sz="6" w:space="1" w:color="B7B7B7"/>
+        </w:pBdr>
+      </w:pPr>
+    </w:p>
+    <w:p>
+      <w:pPr>
         <w:spacing w:after="0"/>
       </w:pPr>
       <w:r>
@@ -262,7 +307,7 @@
           <w:b/>
           <w:sz w:val="20"/>
         </w:rPr>
-        <w:t>☐ Q5. 현재 단계는 무엇인가</w:t>
+        <w:t>Q5. 현재 단계는 무엇인가</w:t>
       </w:r>
     </w:p>
     <w:p>
@@ -303,6 +348,14 @@
     </w:p>
     <w:p>
       <w:pPr>
+        <w:spacing w:after="40"/>
+        <w:pBdr>
+          <w:bottom w:val="single" w:sz="6" w:space="1" w:color="B7B7B7"/>
+        </w:pBdr>
+      </w:pPr>
+    </w:p>
+    <w:p>
+      <w:pPr>
         <w:spacing w:after="0"/>
       </w:pPr>
       <w:r>
@@ -310,7 +363,7 @@
           <w:b/>
           <w:sz w:val="20"/>
         </w:rPr>
-        <w:t>☐ Q6. 가장 오래 걸리는 단계는 무엇인가</w:t>
+        <w:t>Q6. 가장 오래 걸리는 단계는 무엇인가</w:t>
       </w:r>
     </w:p>
     <w:p>
@@ -351,6 +404,14 @@
     </w:p>
     <w:p>
       <w:pPr>
+        <w:spacing w:after="40"/>
+        <w:pBdr>
+          <w:bottom w:val="single" w:sz="6" w:space="1" w:color="B7B7B7"/>
+        </w:pBdr>
+      </w:pPr>
+    </w:p>
+    <w:p>
+      <w:pPr>
         <w:spacing w:after="0"/>
       </w:pPr>
       <w:r>
@@ -358,7 +419,7 @@
           <w:b/>
           <w:sz w:val="20"/>
         </w:rPr>
-        <w:t>☐ Q7. 실패하면 어떤 문제가 생기는가</w:t>
+        <w:t>Q7. 실패하면 어떤 문제가 생기는가</w:t>
       </w:r>
     </w:p>
     <w:p>
@@ -399,6 +460,70 @@
     </w:p>
     <w:p>
       <w:pPr>
+        <w:spacing w:after="40"/>
+        <w:pBdr>
+          <w:bottom w:val="single" w:sz="6" w:space="1" w:color="B7B7B7"/>
+        </w:pBdr>
+      </w:pPr>
+    </w:p>
+    <w:p>
+      <w:r>
+        <w:br w:type="page"/>
+      </w:r>
+    </w:p>
+    <w:p>
+      <w:pPr>
+        <w:spacing w:after="40"/>
+      </w:pPr>
+      <w:r>
+        <w:rPr>
+          <w:b/>
+          <w:color w:val="2B6CB0"/>
+          <w:sz w:val="32"/>
+        </w:rPr>
+        <w:t>Business 32 · AI Skill Studio</w:t>
+      </w:r>
+    </w:p>
+    <w:p>
+      <w:pPr>
+        <w:spacing w:after="40"/>
+      </w:pPr>
+      <w:r>
+        <w:rPr>
+          <w:b/>
+          <w:sz w:val="24"/>
+        </w:rPr>
+        <w:t>Skill Discovery Worksheet — 반복업무 1개 선정</w:t>
+      </w:r>
+    </w:p>
+    <w:p>
+      <w:pPr>
+        <w:spacing w:after="80"/>
+      </w:pPr>
+      <w:r>
+        <w:rPr>
+          <w:b w:val="0"/>
+          <w:color w:val="6B7280"/>
+          <w:sz w:val="16"/>
+        </w:rPr>
+        <w:t>제안검토용 DRAFT · 합성 샘플 기반 · 실제 파일·개인정보는 넣지 마세요</w:t>
+      </w:r>
+    </w:p>
+    <w:p>
+      <w:pPr>
+        <w:spacing w:after="160"/>
+        <w:jc w:val="right"/>
+      </w:pPr>
+      <w:r>
+        <w:rPr>
+          <w:color w:val="6B7280"/>
+          <w:sz w:val="16"/>
+        </w:rPr>
+        <w:t>페이지 2/2</w:t>
+      </w:r>
+    </w:p>
+    <w:p>
+      <w:pPr>
         <w:spacing w:after="0"/>
       </w:pPr>
       <w:r>
@@ -406,7 +531,7 @@
           <w:b/>
           <w:sz w:val="20"/>
         </w:rPr>
-        <w:t>☐ Q8. AI에 넣으면 안 되는 정보는 무엇인가</w:t>
+        <w:t>Q8. AI에 넣으면 안 되는 정보는 무엇인가</w:t>
       </w:r>
     </w:p>
     <w:p>
@@ -447,6 +572,14 @@
     </w:p>
     <w:p>
       <w:pPr>
+        <w:spacing w:after="40"/>
+        <w:pBdr>
+          <w:bottom w:val="single" w:sz="6" w:space="1" w:color="B7B7B7"/>
+        </w:pBdr>
+      </w:pPr>
+    </w:p>
+    <w:p>
+      <w:pPr>
         <w:spacing w:after="0"/>
       </w:pPr>
       <w:r>
@@ -454,7 +587,7 @@
           <w:b/>
           <w:sz w:val="20"/>
         </w:rPr>
-        <w:t>☐ Q9. 필수 증거는 무엇인가</w:t>
+        <w:t>Q9. 필수 증거는 무엇인가</w:t>
       </w:r>
     </w:p>
     <w:p>
@@ -495,6 +628,14 @@
     </w:p>
     <w:p>
       <w:pPr>
+        <w:spacing w:after="40"/>
+        <w:pBdr>
+          <w:bottom w:val="single" w:sz="6" w:space="1" w:color="B7B7B7"/>
+        </w:pBdr>
+      </w:pPr>
+    </w:p>
+    <w:p>
+      <w:pPr>
         <w:spacing w:after="0"/>
       </w:pPr>
       <w:r>
@@ -502,7 +643,7 @@
           <w:b/>
           <w:sz w:val="20"/>
         </w:rPr>
-        <w:t>☐ Q10. 예외는 무엇인가</w:t>
+        <w:t>Q10. 예외는 무엇인가</w:t>
       </w:r>
     </w:p>
     <w:p>
@@ -543,6 +684,14 @@
     </w:p>
     <w:p>
       <w:pPr>
+        <w:spacing w:after="40"/>
+        <w:pBdr>
+          <w:bottom w:val="single" w:sz="6" w:space="1" w:color="B7B7B7"/>
+        </w:pBdr>
+      </w:pPr>
+    </w:p>
+    <w:p>
+      <w:pPr>
         <w:spacing w:after="0"/>
       </w:pPr>
       <w:r>
@@ -550,7 +699,7 @@
           <w:b/>
           <w:sz w:val="20"/>
         </w:rPr>
-        <w:t>☐ Q11. 최종 승인 기준은 무엇인가</w:t>
+        <w:t>Q11. 최종 승인 기준은 무엇인가</w:t>
       </w:r>
     </w:p>
     <w:p>
@@ -564,6 +713,14 @@
         </w:rPr>
         <w:t xml:space="preserve">    (힌트: 승인 조건)</w:t>
       </w:r>
+    </w:p>
+    <w:p>
+      <w:pPr>
+        <w:spacing w:after="40"/>
+        <w:pBdr>
+          <w:bottom w:val="single" w:sz="6" w:space="1" w:color="B7B7B7"/>
+        </w:pBdr>
+      </w:pPr>
     </w:p>
     <w:p>
       <w:pPr>
@@ -615,6 +772,44 @@
     </w:p>
     <w:p>
       <w:pPr>
+        <w:spacing w:after="20"/>
+      </w:pPr>
+      <w:r>
+        <w:rPr>
+          <w:sz w:val="18"/>
+        </w:rPr>
+        <w:t>☐ 주 1회 미만    ☐ 주 1회    ☐ 주 2~3회    ☐ 매일</w:t>
+      </w:r>
+    </w:p>
+    <w:p>
+      <w:pPr>
+        <w:spacing w:after="20"/>
+      </w:pPr>
+      <w:r>
+        <w:rPr>
+          <w:sz w:val="18"/>
+        </w:rPr>
+        <w:t xml:space="preserve">기타: </w:t>
+      </w:r>
+    </w:p>
+    <w:p>
+      <w:pPr>
+        <w:spacing w:after="40"/>
+        <w:pBdr>
+          <w:bottom w:val="single" w:sz="6" w:space="1" w:color="B7B7B7"/>
+        </w:pBdr>
+      </w:pPr>
+    </w:p>
+    <w:p>
+      <w:pPr>
+        <w:spacing w:after="40"/>
+        <w:pBdr>
+          <w:bottom w:val="single" w:sz="6" w:space="1" w:color="B7B7B7"/>
+        </w:pBdr>
+      </w:pPr>
+    </w:p>
+    <w:p>
+      <w:pPr>
         <w:spacing w:after="40"/>
         <w:pBdr>
           <w:bottom w:val="single" w:sz="6" w:space="1" w:color="B7B7B7"/>
@@ -646,7 +841,7 @@
           <w:b/>
           <w:sz w:val="20"/>
         </w:rPr>
-        <w:t>☐ Q13. 출력 형식은 무엇인가</w:t>
+        <w:t>Q13. 출력 형식은 무엇인가</w:t>
       </w:r>
     </w:p>
     <w:p>
@@ -687,29 +882,84 @@
     </w:p>
     <w:p>
       <w:pPr>
-        <w:spacing w:after="0"/>
+        <w:spacing w:after="40"/>
+        <w:pBdr>
+          <w:bottom w:val="single" w:sz="6" w:space="1" w:color="B7B7B7"/>
+        </w:pBdr>
+      </w:pPr>
+    </w:p>
+    <w:p>
+      <w:pPr>
+        <w:spacing w:after="80"/>
+      </w:pPr>
+      <w:r>
+        <w:rPr>
+          <w:b/>
+          <w:color w:val="2F855A"/>
+          <w:sz w:val="22"/>
+        </w:rPr>
+        <w:t>작성 완료 후 확인</w:t>
+      </w:r>
+    </w:p>
+    <w:p>
+      <w:pPr>
+        <w:spacing w:after="40"/>
       </w:pPr>
       <w:r>
         <w:rPr>
           <w:b w:val="0"/>
           <w:color w:val="6B7280"/>
-          <w:sz w:val="16"/>
+          <w:sz w:val="18"/>
         </w:rPr>
-        <w:t>작성 후에는 업무명·단계·소요시간·검토 구조만 확인하며, 실제 견적서·내부 문서·개인정보를 수집하지 않습니다.</w:t>
+        <w:t>업무명·단계·소요시간·검토 구조만 확인하며, 실제 견적서·내부 문서·개인정보를 수집하지 않습니다.</w:t>
       </w:r>
     </w:p>
     <w:p>
       <w:pPr>
-        <w:spacing w:after="0"/>
+        <w:spacing w:after="40"/>
       </w:pPr>
       <w:r>
         <w:rPr>
           <w:b w:val="0"/>
-          <w:color w:val="2F855A"/>
-          <w:sz w:val="16"/>
+          <w:color w:val="6B7280"/>
+          <w:sz w:val="18"/>
         </w:rPr>
-        <w:t>사람 검토와 승인이 필수입니다. AI가 자동 승인하지 않습니다. 모든 예시는 합성입니다.</w:t>
+        <w:t>사람 검토와 승인이 필수입니다. AI가 자동 승인하지 않습니다.</w:t>
       </w:r>
+    </w:p>
+    <w:p>
+      <w:pPr>
+        <w:spacing w:after="40"/>
+      </w:pPr>
+      <w:r>
+        <w:rPr>
+          <w:b w:val="0"/>
+          <w:color w:val="6B7280"/>
+          <w:sz w:val="18"/>
+        </w:rPr>
+        <w:t>모든 예시는 합성입니다.</w:t>
+      </w:r>
+    </w:p>
+    <w:p>
+      <w:pPr>
+        <w:spacing w:after="40"/>
+      </w:pPr>
+      <w:r>
+        <w:rPr>
+          <w:b w:val="0"/>
+          <w:color w:val="6B7280"/>
+          <w:sz w:val="18"/>
+        </w:rPr>
+        <w:t>선정한 반복업무 1개:</w:t>
+      </w:r>
+    </w:p>
+    <w:p>
+      <w:pPr>
+        <w:spacing w:after="40"/>
+        <w:pBdr>
+          <w:bottom w:val="single" w:sz="6" w:space="1" w:color="B7B7B7"/>
+        </w:pBdr>
+      </w:pPr>
     </w:p>
     <w:sectPr>
       <w:pgSz w:w="11906" w:h="16838"/>

</xml_diff>